<commit_message>
Proofread Project Notes DOCX files
</commit_message>
<xml_diff>
--- a/doc/Legacy Test Fixture Documentation/Project Notes/Backend CLI.docx
+++ b/doc/Legacy Test Fixture Documentation/Project Notes/Backend CLI.docx
@@ -15,7 +15,7 @@
         <w:t>A</w:t>
       </w:r>
       <w:r>
-        <w:t xml:space="preserve"> command line utility to execute all M1-3200 Testf Fixture tests.</w:t>
+        <w:t xml:space="preserve"> command line utility to execute all M1-3200 Test Fixture tests.</w:t>
       </w:r>
     </w:p>
     <w:p>
@@ -26,7 +26,7 @@
         <w:t>m1tfd1</w:t>
       </w:r>
       <w:r>
-        <w:t>.cli”</w:t>
+        <w:t>.CLI”</w:t>
       </w:r>
     </w:p>
     <w:p>

</xml_diff>